<commit_message>
Deploy preview for PR 52 🛫
</commit_message>
<xml_diff>
--- a/pr-preview/pr-52/demo-shortcode.docx
+++ b/pr-preview/pr-52/demo-shortcode.docx
@@ -346,6 +346,24 @@
       </w:r>
       <w:r>
         <w:t xml:space="preserve"> </w:t>
+      </w:r>
+      <w:r>
+        <w:t xml:space="preserve"> </w:t>
+      </w:r>
+      <w:r>
+        <w:t xml:space="preserve"> </w:t>
+      </w:r>
+      <w:r>
+        <w:t xml:space="preserve">% underbrace shorthand</w:t>
+      </w:r>
+      <w:r>
+        <w:t xml:space="preserve"> </w:t>
+      </w:r>
+      <w:r>
+        <w:t xml:space="preserve"> </w:t>
+      </w:r>
+      <w:r>
+        <w:t xml:space="preserve">% underbrace with subscript label</w:t>
       </w:r>
       <w:r>
         <w:t xml:space="preserve"> </w:t>

</xml_diff>